<commit_message>
Manual único del arco en C con lupa y transcripción (12 pasos, 9 páginas)
Reprocesado con gemini-3.5-flash a resolución alta; incluye la transcripción
del audio (30 segmentos) como anexo.

Co-Authored-By: Claude Fable 5.1 <noreply@anthropic.com>
Claude-Session: https://claude.ai/code/session_01ULRY7Vd3j1Y2aQaqmzKdgd
</commit_message>
<xml_diff>
--- a/resumen-videos/resultados/Capacitacion_arco_en_C/Capacitacion_arco_en_C.docx
+++ b/resumen-videos/resultados/Capacitacion_arco_en_C/Capacitacion_arco_en_C.docx
@@ -48,7 +48,7 @@
           <w:color w:val="222222"/>
           <w:sz w:val="23"/>
         </w:rPr>
-        <w:t>Este video instructivo muestra la operación básica y el posicionamiento de un sistema de arco en C Philips en un entorno quirúrgico real. Se explican los diferentes movimientos mecánicos del equipo, la preparación estéril y las consideraciones de espacio en el quirófano.</w:t>
+        <w:t>Este video instructivo muestra la operación de un sistema de arco en C de Philips en un entorno quirúrgico. Se detallan los movimientos mecánicos del brazo, la colocación de cubiertas estériles de protección y el posicionamiento del equipo respecto a la mesa de operaciones durante un procedimiento clínico real.</w:t>
       </w:r>
     </w:p>
     <w:p>
@@ -160,7 +160,7 @@
           <w:color w:val="111111"/>
           <w:sz w:val="21"/>
         </w:rPr>
-        <w:t>13</w:t>
+        <w:t>12</w:t>
       </w:r>
     </w:p>
     <w:p>
@@ -188,7 +188,7 @@
           <w:color w:val="111111"/>
           <w:sz w:val="21"/>
         </w:rPr>
-        <w:t>5</w:t>
+        <w:t>6</w:t>
       </w:r>
     </w:p>
     <w:p>
@@ -287,7 +287,7 @@
                 <w:color w:val="111111"/>
                 <w:sz w:val="22"/>
               </w:rPr>
-              <w:t>Posicionamiento</w:t>
+              <w:t>Ajuste de Movimientos Mecánicos</w:t>
             </w:r>
           </w:p>
         </w:tc>
@@ -317,7 +317,7 @@
                 <w:color w:val="222222"/>
                 <w:sz w:val="20"/>
               </w:rPr>
-              <w:t>1. Liberar el movimiento horizontal del brazo</w:t>
+              <w:t>1. Identificar movimiento de rotación horizontal</w:t>
             </w:r>
           </w:p>
         </w:tc>
@@ -365,7 +365,7 @@
                 <w:color w:val="222222"/>
                 <w:sz w:val="20"/>
               </w:rPr>
-              <w:t>2. Bloquear la rotación del arco en C</w:t>
+              <w:t>2. Bloquear o liberar movimiento horizontal</w:t>
             </w:r>
           </w:p>
         </w:tc>
@@ -389,7 +389,7 @@
                 <w:sz w:val="20"/>
               </w:rPr>
               <w:tab/>
-              <w:t>00:25 · pág. 3</w:t>
+              <w:t>00:24 · pág. 3</w:t>
             </w:r>
           </w:p>
         </w:tc>
@@ -413,7 +413,7 @@
                 <w:color w:val="222222"/>
                 <w:sz w:val="20"/>
               </w:rPr>
-              <w:t>3. Ajustar la angulación para el procedimiento</w:t>
+              <w:t>3. Ajustar ángulo de inclinación lateral</w:t>
             </w:r>
           </w:p>
         </w:tc>
@@ -437,7 +437,7 @@
                 <w:sz w:val="20"/>
               </w:rPr>
               <w:tab/>
-              <w:t>00:41 · pág. 4</w:t>
+              <w:t>00:42 · pág. 4</w:t>
             </w:r>
           </w:p>
         </w:tc>
@@ -461,7 +461,7 @@
                 <w:color w:val="222222"/>
                 <w:sz w:val="20"/>
               </w:rPr>
-              <w:t>4. Realizar la rotación orbital del brazo</w:t>
+              <w:t>4. Ejecutar movimiento de rotación orbital</w:t>
             </w:r>
           </w:p>
         </w:tc>
@@ -509,7 +509,7 @@
                 <w:color w:val="111111"/>
                 <w:sz w:val="22"/>
               </w:rPr>
-              <w:t>Seguridad</w:t>
+              <w:t>Seguridad y Radioprotección</w:t>
             </w:r>
           </w:p>
         </w:tc>
@@ -539,7 +539,7 @@
                 <w:color w:val="222222"/>
                 <w:sz w:val="20"/>
               </w:rPr>
-              <w:t>5. Verificar la disponibilidad de delantales plomados</w:t>
+              <w:t>5. Preparar equipamiento de radioprotección</w:t>
             </w:r>
           </w:p>
         </w:tc>
@@ -563,7 +563,7 @@
                 <w:sz w:val="20"/>
               </w:rPr>
               <w:tab/>
-              <w:t>01:25 · pág. 5</w:t>
+              <w:t>01:23 · pág. 5</w:t>
             </w:r>
           </w:p>
         </w:tc>
@@ -587,7 +587,7 @@
                 <w:color w:val="111111"/>
                 <w:sz w:val="22"/>
               </w:rPr>
-              <w:t>Posicionamiento</w:t>
+              <w:t>Posicionamiento del Paciente</w:t>
             </w:r>
           </w:p>
         </w:tc>
@@ -617,7 +617,7 @@
                 <w:color w:val="222222"/>
                 <w:sz w:val="20"/>
               </w:rPr>
-              <w:t>6. Coordinar el movimiento de la mesa</w:t>
+              <w:t>6. Operar control remoto de camilla</w:t>
             </w:r>
           </w:p>
         </w:tc>
@@ -665,7 +665,7 @@
                 <w:color w:val="111111"/>
                 <w:sz w:val="22"/>
               </w:rPr>
-              <w:t>Preparación</w:t>
+              <w:t>Preparación Estéril</w:t>
             </w:r>
           </w:p>
         </w:tc>
@@ -695,7 +695,7 @@
                 <w:color w:val="222222"/>
                 <w:sz w:val="20"/>
               </w:rPr>
-              <w:t>7. Colocar la cubierta estéril en el arco</w:t>
+              <w:t>7. Colocar cubierta estéril protectora</w:t>
             </w:r>
           </w:p>
         </w:tc>
@@ -726,54 +726,6 @@
       </w:tr>
       <w:tr>
         <w:trPr>
-          <w:trHeight w:val="280" w:hRule="exact"/>
-        </w:trPr>
-        <w:tc>
-          <w:tcPr>
-            <w:tcW w:type="dxa" w:w="13890"/>
-          </w:tcPr>
-          <w:p>
-            <w:pPr>
-              <w:spacing w:before="0" w:after="0" w:line="280" w:lineRule="exact"/>
-            </w:pPr>
-            <w:r>
-              <w:rPr>
-                <w:b w:val="0"/>
-                <w:i w:val="0"/>
-                <w:color w:val="222222"/>
-                <w:sz w:val="20"/>
-              </w:rPr>
-              <w:t>8. Ajustar el arco con la funda colocada</w:t>
-            </w:r>
-          </w:p>
-        </w:tc>
-        <w:tc>
-          <w:tcPr>
-            <w:tcW w:type="dxa" w:w="1814"/>
-          </w:tcPr>
-          <w:p>
-            <w:pPr>
-              <w:tabs>
-                <w:tab w:pos="1757" w:val="right" w:leader="dot"/>
-              </w:tabs>
-              <w:spacing w:before="0" w:after="0" w:line="280" w:lineRule="exact"/>
-              <w:jc w:val="right"/>
-            </w:pPr>
-            <w:r>
-              <w:rPr>
-                <w:b w:val="0"/>
-                <w:i w:val="0"/>
-                <w:color w:val="666666"/>
-                <w:sz w:val="20"/>
-              </w:rPr>
-              <w:tab/>
-              <w:t>02:11 · pág. 6</w:t>
-            </w:r>
-          </w:p>
-        </w:tc>
-      </w:tr>
-      <w:tr>
-        <w:trPr>
           <w:trHeight w:val="500" w:hRule="exact"/>
         </w:trPr>
         <w:tc>
@@ -791,7 +743,7 @@
                 <w:color w:val="111111"/>
                 <w:sz w:val="22"/>
               </w:rPr>
-              <w:t>Posicionamiento</w:t>
+              <w:t>Posicionamiento del Paciente</w:t>
             </w:r>
           </w:p>
         </w:tc>
@@ -821,7 +773,7 @@
                 <w:color w:val="222222"/>
                 <w:sz w:val="20"/>
               </w:rPr>
-              <w:t>9. Comprobar la habilitación del espacio físico</w:t>
+              <w:t>8. Alinear arco en C con camilla</w:t>
             </w:r>
           </w:p>
         </w:tc>
@@ -845,7 +797,7 @@
                 <w:sz w:val="20"/>
               </w:rPr>
               <w:tab/>
-              <w:t>02:32 · pág. 7</w:t>
+              <w:t>02:10 · pág. 6</w:t>
             </w:r>
           </w:p>
         </w:tc>
@@ -869,7 +821,7 @@
                 <w:color w:val="111111"/>
                 <w:sz w:val="22"/>
               </w:rPr>
-              <w:t>Adquisición de imagen</w:t>
+              <w:t>Adquisición de Imagen</w:t>
             </w:r>
           </w:p>
         </w:tc>
@@ -899,7 +851,7 @@
                 <w:color w:val="222222"/>
                 <w:sz w:val="20"/>
               </w:rPr>
-              <w:t>10. Revisar los parámetros en la pantalla</w:t>
+              <w:t>9. Verificar parámetros en pantalla consola</w:t>
             </w:r>
           </w:p>
         </w:tc>
@@ -923,9 +875,39 @@
                 <w:sz w:val="20"/>
               </w:rPr>
               <w:tab/>
-              <w:t>02:48 · pág. 7</w:t>
+              <w:t>02:31 · pág. 7</w:t>
             </w:r>
           </w:p>
+        </w:tc>
+      </w:tr>
+      <w:tr>
+        <w:trPr>
+          <w:trHeight w:val="500" w:hRule="exact"/>
+        </w:trPr>
+        <w:tc>
+          <w:tcPr>
+            <w:tcW w:type="dxa" w:w="13890"/>
+          </w:tcPr>
+          <w:p>
+            <w:pPr>
+              <w:spacing w:before="200" w:after="0" w:line="300" w:lineRule="exact"/>
+            </w:pPr>
+            <w:r>
+              <w:rPr>
+                <w:b/>
+                <w:i w:val="0"/>
+                <w:color w:val="111111"/>
+                <w:sz w:val="22"/>
+              </w:rPr>
+              <w:t>Posicionamiento del Paciente</w:t>
+            </w:r>
+          </w:p>
+        </w:tc>
+        <w:tc>
+          <w:tcPr>
+            <w:tcW w:type="dxa" w:w="1814"/>
+          </w:tcPr>
+          <w:p/>
         </w:tc>
       </w:tr>
       <w:tr>
@@ -947,7 +929,85 @@
                 <w:color w:val="222222"/>
                 <w:sz w:val="20"/>
               </w:rPr>
-              <w:t>11. Monitorear la inserción del catéter</w:t>
+              <w:t>10. Definir trayectoria de aproximación</w:t>
+            </w:r>
+          </w:p>
+        </w:tc>
+        <w:tc>
+          <w:tcPr>
+            <w:tcW w:type="dxa" w:w="1814"/>
+          </w:tcPr>
+          <w:p>
+            <w:pPr>
+              <w:tabs>
+                <w:tab w:pos="1757" w:val="right" w:leader="dot"/>
+              </w:tabs>
+              <w:spacing w:before="0" w:after="0" w:line="280" w:lineRule="exact"/>
+              <w:jc w:val="right"/>
+            </w:pPr>
+            <w:r>
+              <w:rPr>
+                <w:b w:val="0"/>
+                <w:i w:val="0"/>
+                <w:color w:val="666666"/>
+                <w:sz w:val="20"/>
+              </w:rPr>
+              <w:tab/>
+              <w:t>02:41 · pág. 7</w:t>
+            </w:r>
+          </w:p>
+        </w:tc>
+      </w:tr>
+      <w:tr>
+        <w:trPr>
+          <w:trHeight w:val="500" w:hRule="exact"/>
+        </w:trPr>
+        <w:tc>
+          <w:tcPr>
+            <w:tcW w:type="dxa" w:w="13890"/>
+          </w:tcPr>
+          <w:p>
+            <w:pPr>
+              <w:spacing w:before="200" w:after="0" w:line="300" w:lineRule="exact"/>
+            </w:pPr>
+            <w:r>
+              <w:rPr>
+                <w:b/>
+                <w:i w:val="0"/>
+                <w:color w:val="111111"/>
+                <w:sz w:val="22"/>
+              </w:rPr>
+              <w:t>Adquisición de Imagen</w:t>
+            </w:r>
+          </w:p>
+        </w:tc>
+        <w:tc>
+          <w:tcPr>
+            <w:tcW w:type="dxa" w:w="1814"/>
+          </w:tcPr>
+          <w:p/>
+        </w:tc>
+      </w:tr>
+      <w:tr>
+        <w:trPr>
+          <w:trHeight w:val="280" w:hRule="exact"/>
+        </w:trPr>
+        <w:tc>
+          <w:tcPr>
+            <w:tcW w:type="dxa" w:w="13890"/>
+          </w:tcPr>
+          <w:p>
+            <w:pPr>
+              <w:spacing w:before="0" w:after="0" w:line="280" w:lineRule="exact"/>
+            </w:pPr>
+            <w:r>
+              <w:rPr>
+                <w:b w:val="0"/>
+                <w:i w:val="0"/>
+                <w:color w:val="222222"/>
+                <w:sz w:val="20"/>
+              </w:rPr>
+              <w:t>11. Monitorear adquisición en tiempo real</w:t>
             </w:r>
           </w:p>
         </w:tc>
@@ -995,7 +1055,7 @@
                 <w:color w:val="111111"/>
                 <w:sz w:val="22"/>
               </w:rPr>
-              <w:t>Apagado y limpieza</w:t>
+              <w:t>Apagado y Desconexión</w:t>
             </w:r>
           </w:p>
         </w:tc>
@@ -1025,7 +1085,7 @@
                 <w:color w:val="222222"/>
                 <w:sz w:val="20"/>
               </w:rPr>
-              <w:t>12. Apagar el sistema al finalizar</w:t>
+              <w:t>12. Desconectar cables tras finalizar procedimiento</w:t>
             </w:r>
           </w:p>
         </w:tc>
@@ -1049,55 +1109,7 @@
                 <w:sz w:val="20"/>
               </w:rPr>
               <w:tab/>
-              <w:t>03:44 · pág. 8</w:t>
-            </w:r>
-          </w:p>
-        </w:tc>
-      </w:tr>
-      <w:tr>
-        <w:trPr>
-          <w:trHeight w:val="280" w:hRule="exact"/>
-        </w:trPr>
-        <w:tc>
-          <w:tcPr>
-            <w:tcW w:type="dxa" w:w="13890"/>
-          </w:tcPr>
-          <w:p>
-            <w:pPr>
-              <w:spacing w:before="0" w:after="0" w:line="280" w:lineRule="exact"/>
-            </w:pPr>
-            <w:r>
-              <w:rPr>
-                <w:b w:val="0"/>
-                <w:i w:val="0"/>
-                <w:color w:val="222222"/>
-                <w:sz w:val="20"/>
-              </w:rPr>
-              <w:t>13. Desconectar los cables de alimentación</w:t>
-            </w:r>
-          </w:p>
-        </w:tc>
-        <w:tc>
-          <w:tcPr>
-            <w:tcW w:type="dxa" w:w="1814"/>
-          </w:tcPr>
-          <w:p>
-            <w:pPr>
-              <w:tabs>
-                <w:tab w:pos="1757" w:val="right" w:leader="dot"/>
-              </w:tabs>
-              <w:spacing w:before="0" w:after="0" w:line="280" w:lineRule="exact"/>
-              <w:jc w:val="right"/>
-            </w:pPr>
-            <w:r>
-              <w:rPr>
-                <w:b w:val="0"/>
-                <w:i w:val="0"/>
-                <w:color w:val="666666"/>
-                <w:sz w:val="20"/>
-              </w:rPr>
-              <w:tab/>
-              <w:t>04:03 · pág. 9</w:t>
+              <w:t>04:02 · pág. 8</w:t>
             </w:r>
           </w:p>
         </w:tc>
@@ -1131,7 +1143,7 @@
           <w:sz w:val="16"/>
         </w:rPr>
         <w:tab/>
-        <w:t>Pasos 1–2 de 13</w:t>
+        <w:t>Pasos 1–2 de 12</w:t>
       </w:r>
     </w:p>
     <w:tbl>
@@ -1217,7 +1229,7 @@
                 <w:color w:val="666666"/>
                 <w:sz w:val="17"/>
               </w:rPr>
-              <w:t>PASO 1 · POSICIONAMIENTO · 00:02</w:t>
+              <w:t>PASO 1 · AJUSTE DE MOVIMIENTOS MECÁNICOS · 00:02</w:t>
             </w:r>
           </w:p>
           <w:p>
@@ -1231,7 +1243,7 @@
                 <w:color w:val="111111"/>
                 <w:sz w:val="26"/>
               </w:rPr>
-              <w:t>Liberar el movimiento horizontal del brazo</w:t>
+              <w:t>Identificar movimiento de rotación horizontal</w:t>
             </w:r>
           </w:p>
           <w:p>
@@ -1245,7 +1257,7 @@
                 <w:color w:val="222222"/>
                 <w:sz w:val="21"/>
               </w:rPr>
-              <w:t>El operador muestra cómo destrabar la palanca de bloqueo para permitir el desplazamiento horizontal del arco en C hacia adelante y hacia atrás.</w:t>
+              <w:t>El instructor demuestra el movimiento de rotación horizontal del brazo en C sobre su propio eje, liberando los frenos manuales correspondientes.</w:t>
             </w:r>
           </w:p>
         </w:tc>
@@ -1277,7 +1289,7 @@
                     <a:graphicData uri="http://schemas.openxmlformats.org/drawingml/2006/picture">
                       <pic:pic>
                         <pic:nvPicPr>
-                          <pic:cNvPr id="0" name="02_00-25_anotada.jpg"/>
+                          <pic:cNvPr id="0" name="02_00-24_anotada.jpg"/>
                           <pic:cNvPicPr/>
                         </pic:nvPicPr>
                         <pic:blipFill>
@@ -1311,7 +1323,7 @@
                 <w:color w:val="666666"/>
                 <w:sz w:val="17"/>
               </w:rPr>
-              <w:t>PASO 2 · POSICIONAMIENTO · 00:25</w:t>
+              <w:t>PASO 2 · AJUSTE DE MOVIMIENTOS MECÁNICOS · 00:24</w:t>
             </w:r>
           </w:p>
           <w:p>
@@ -1325,7 +1337,7 @@
                 <w:color w:val="111111"/>
                 <w:sz w:val="26"/>
               </w:rPr>
-              <w:t>Bloquear la rotación del arco en C</w:t>
+              <w:t>Bloquear o liberar movimiento horizontal</w:t>
             </w:r>
           </w:p>
           <w:p>
@@ -1339,7 +1351,7 @@
                 <w:color w:val="222222"/>
                 <w:sz w:val="21"/>
               </w:rPr>
-              <w:t>Se muestra en detalle la palanca de bloqueo con el icono indicador para fijar la rotación del arco en una posición determinada.</w:t>
+              <w:t>Se señala la manilla de bloqueo del brazo para detener o liberar el movimiento de rotación horizontal del arco en C de forma segura.</w:t>
             </w:r>
           </w:p>
         </w:tc>
@@ -1373,7 +1385,7 @@
           <w:sz w:val="16"/>
         </w:rPr>
         <w:tab/>
-        <w:t>Pasos 3–4 de 13</w:t>
+        <w:t>Pasos 3–4 de 12</w:t>
       </w:r>
     </w:p>
     <w:tbl>
@@ -1425,7 +1437,7 @@
                     <a:graphicData uri="http://schemas.openxmlformats.org/drawingml/2006/picture">
                       <pic:pic>
                         <pic:nvPicPr>
-                          <pic:cNvPr id="0" name="03_00-41_anotada.jpg"/>
+                          <pic:cNvPr id="0" name="03_00-42_anotada.jpg"/>
                           <pic:cNvPicPr/>
                         </pic:nvPicPr>
                         <pic:blipFill>
@@ -1459,7 +1471,7 @@
                 <w:color w:val="666666"/>
                 <w:sz w:val="17"/>
               </w:rPr>
-              <w:t>PASO 3 · POSICIONAMIENTO · 00:41</w:t>
+              <w:t>PASO 3 · AJUSTE DE MOVIMIENTOS MECÁNICOS · 00:42</w:t>
             </w:r>
           </w:p>
           <w:p>
@@ -1473,7 +1485,7 @@
                 <w:color w:val="111111"/>
                 <w:sz w:val="26"/>
               </w:rPr>
-              <w:t>Ajustar la angulación para el procedimiento</w:t>
+              <w:t>Ajustar ángulo de inclinación lateral</w:t>
             </w:r>
           </w:p>
           <w:p>
@@ -1487,7 +1499,7 @@
                 <w:color w:val="222222"/>
                 <w:sz w:val="21"/>
               </w:rPr>
-              <w:t>El operador explica que, aunque generalmente no se necesita ángulo para la zona renal, se puede inclinar el arco si es requerido.</w:t>
+              <w:t>Se demuestra la liberación de los seguros mecánicos, identificando los iconos de candado abierto y cerrado grabados en la pieza, para permitir la inclinación angular del arco en C.</w:t>
             </w:r>
           </w:p>
         </w:tc>
@@ -1553,7 +1565,7 @@
                 <w:color w:val="666666"/>
                 <w:sz w:val="17"/>
               </w:rPr>
-              <w:t>PASO 4 · POSICIONAMIENTO · 00:55</w:t>
+              <w:t>PASO 4 · AJUSTE DE MOVIMIENTOS MECÁNICOS · 00:55</w:t>
             </w:r>
           </w:p>
           <w:p>
@@ -1567,7 +1579,7 @@
                 <w:color w:val="111111"/>
                 <w:sz w:val="26"/>
               </w:rPr>
-              <w:t>Realizar la rotación orbital del brazo</w:t>
+              <w:t>Ejecutar movimiento de rotación orbital</w:t>
             </w:r>
           </w:p>
           <w:p>
@@ -1581,7 +1593,7 @@
                 <w:color w:val="222222"/>
                 <w:sz w:val="21"/>
               </w:rPr>
-              <w:t>Se destraba el freno correspondiente para rotar orbitalmente el arco, permitiendo obtener proyecciones oblicuas o laterales.</w:t>
+              <w:t>El operador realiza el deslizamiento orbital del brazo en C para ajustar el plano de proyección radiográfica sobre el paciente.</w:t>
             </w:r>
           </w:p>
         </w:tc>
@@ -1615,7 +1627,7 @@
           <w:sz w:val="16"/>
         </w:rPr>
         <w:tab/>
-        <w:t>Pasos 5–6 de 13</w:t>
+        <w:t>Pasos 5–6 de 12</w:t>
       </w:r>
     </w:p>
     <w:tbl>
@@ -1667,7 +1679,7 @@
                     <a:graphicData uri="http://schemas.openxmlformats.org/drawingml/2006/picture">
                       <pic:pic>
                         <pic:nvPicPr>
-                          <pic:cNvPr id="0" name="05_01-25_anotada.jpg"/>
+                          <pic:cNvPr id="0" name="05_01-23.jpg"/>
                           <pic:cNvPicPr/>
                         </pic:nvPicPr>
                         <pic:blipFill>
@@ -1701,7 +1713,7 @@
                 <w:color w:val="666666"/>
                 <w:sz w:val="17"/>
               </w:rPr>
-              <w:t>PASO 5 · SEGURIDAD · 01:25</w:t>
+              <w:t>PASO 5 · SEGURIDAD Y RADIOPROTECCIÓN · 01:23</w:t>
             </w:r>
           </w:p>
           <w:p>
@@ -1715,7 +1727,7 @@
                 <w:color w:val="111111"/>
                 <w:sz w:val="26"/>
               </w:rPr>
-              <w:t>Verificar la disponibilidad de delantales plomados</w:t>
+              <w:t>Preparar equipamiento de radioprotección</w:t>
             </w:r>
           </w:p>
           <w:p>
@@ -1729,7 +1741,7 @@
                 <w:color w:val="222222"/>
                 <w:sz w:val="21"/>
               </w:rPr>
-              <w:t>Se constata la presencia de los delantales de protección radiológica en el perchero antes de dar inicio a la emisión de radiación.</w:t>
+              <w:t>El personal se dirige a buscar los delantales plomados antes de iniciar la emisión de radiación en el pabellón.</w:t>
             </w:r>
           </w:p>
         </w:tc>
@@ -1795,7 +1807,7 @@
                 <w:color w:val="666666"/>
                 <w:sz w:val="17"/>
               </w:rPr>
-              <w:t>PASO 6 · POSICIONAMIENTO · 01:39</w:t>
+              <w:t>PASO 6 · POSICIONAMIENTO DEL PACIENTE · 01:39</w:t>
             </w:r>
           </w:p>
           <w:p>
@@ -1809,7 +1821,7 @@
                 <w:color w:val="111111"/>
                 <w:sz w:val="26"/>
               </w:rPr>
-              <w:t>Coordinar el movimiento de la mesa</w:t>
+              <w:t>Operar control remoto de camilla</w:t>
             </w:r>
           </w:p>
           <w:p>
@@ -1823,7 +1835,7 @@
                 <w:color w:val="222222"/>
                 <w:sz w:val="21"/>
               </w:rPr>
-              <w:t>Se utiliza el control remoto de la mesa quirúrgica para ajustar la altura y posición del paciente en relación con el arco.</w:t>
+              <w:t>Se utiliza el mando de la camilla quirúrgica que contiene iconos con diferentes planos y posiciones para acomodar al paciente antes del examen.</w:t>
             </w:r>
           </w:p>
         </w:tc>
@@ -1857,7 +1869,7 @@
           <w:sz w:val="16"/>
         </w:rPr>
         <w:tab/>
-        <w:t>Pasos 7–8 de 13</w:t>
+        <w:t>Pasos 7–8 de 12</w:t>
       </w:r>
     </w:p>
     <w:tbl>
@@ -1943,7 +1955,7 @@
                 <w:color w:val="666666"/>
                 <w:sz w:val="17"/>
               </w:rPr>
-              <w:t>PASO 7 · PREPARACIÓN · 01:57</w:t>
+              <w:t>PASO 7 · PREPARACIÓN ESTÉRIL · 01:57</w:t>
             </w:r>
           </w:p>
           <w:p>
@@ -1957,7 +1969,7 @@
                 <w:color w:val="111111"/>
                 <w:sz w:val="26"/>
               </w:rPr>
-              <w:t>Colocar la cubierta estéril en el arco</w:t>
+              <w:t>Colocar cubierta estéril protectora</w:t>
             </w:r>
           </w:p>
           <w:p>
@@ -1971,7 +1983,7 @@
                 <w:color w:val="222222"/>
                 <w:sz w:val="21"/>
               </w:rPr>
-              <w:t>Se coloca una funda plástica estéril sobre el receptor de imagen para mantener la asepsia del campo quirúrgico.</w:t>
+              <w:t>Se muestra la funda plástica estéril colocada sobre el receptor de imagen para proteger el campo operatorio y evitar la contaminación.</w:t>
             </w:r>
           </w:p>
         </w:tc>
@@ -2003,7 +2015,7 @@
                     <a:graphicData uri="http://schemas.openxmlformats.org/drawingml/2006/picture">
                       <pic:pic>
                         <pic:nvPicPr>
-                          <pic:cNvPr id="0" name="08_02-11_anotada.jpg"/>
+                          <pic:cNvPr id="0" name="08_02-10_anotada.jpg"/>
                           <pic:cNvPicPr/>
                         </pic:nvPicPr>
                         <pic:blipFill>
@@ -2037,7 +2049,7 @@
                 <w:color w:val="666666"/>
                 <w:sz w:val="17"/>
               </w:rPr>
-              <w:t>PASO 8 · PREPARACIÓN · 02:11</w:t>
+              <w:t>PASO 8 · POSICIONAMIENTO DEL PACIENTE · 02:10</w:t>
             </w:r>
           </w:p>
           <w:p>
@@ -2051,7 +2063,7 @@
                 <w:color w:val="111111"/>
                 <w:sz w:val="26"/>
               </w:rPr>
-              <w:t>Ajustar el arco con la funda colocada</w:t>
+              <w:t>Alinear arco en C con camilla</w:t>
             </w:r>
           </w:p>
           <w:p>
@@ -2065,7 +2077,7 @@
                 <w:color w:val="222222"/>
                 <w:sz w:val="21"/>
               </w:rPr>
-              <w:t>Se realizan movimientos de prueba con el arco cubierto para asegurar que la funda no limite el rango de movimiento necesario.</w:t>
+              <w:t>Se realiza el acercamiento físico del equipo para introducir el detector y el tubo de rayos X bajo y sobre la camilla respectivamente, sosteniendo la empuñadura del arco.</w:t>
             </w:r>
           </w:p>
         </w:tc>
@@ -2099,7 +2111,7 @@
           <w:sz w:val="16"/>
         </w:rPr>
         <w:tab/>
-        <w:t>Pasos 9–10 de 13</w:t>
+        <w:t>Pasos 9–10 de 12</w:t>
       </w:r>
     </w:p>
     <w:tbl>
@@ -2151,7 +2163,7 @@
                     <a:graphicData uri="http://schemas.openxmlformats.org/drawingml/2006/picture">
                       <pic:pic>
                         <pic:nvPicPr>
-                          <pic:cNvPr id="0" name="09_02-32_anotada.jpg"/>
+                          <pic:cNvPr id="0" name="09_02-31_anotada.jpg"/>
                           <pic:cNvPicPr/>
                         </pic:nvPicPr>
                         <pic:blipFill>
@@ -2185,7 +2197,7 @@
                 <w:color w:val="666666"/>
                 <w:sz w:val="17"/>
               </w:rPr>
-              <w:t>PASO 9 · POSICIONAMIENTO · 02:32</w:t>
+              <w:t>PASO 9 · ADQUISICIÓN DE IMAGEN · 02:31</w:t>
             </w:r>
           </w:p>
           <w:p>
@@ -2199,7 +2211,7 @@
                 <w:color w:val="111111"/>
                 <w:sz w:val="26"/>
               </w:rPr>
-              <w:t>Comprobar la habilitación del espacio físico</w:t>
+              <w:t>Verificar parámetros en pantalla consola</w:t>
             </w:r>
           </w:p>
           <w:p>
@@ -2213,7 +2225,7 @@
                 <w:color w:val="222222"/>
                 <w:sz w:val="21"/>
               </w:rPr>
-              <w:t>El operador indica la importancia de mantener despejada la zona de tránsito del arco para evitar colisiones con otros equipos; en el panel se muestra el adhesivo END9 cl-1096.</w:t>
+              <w:t>Se muestran los parámetros de adquisición en la consola de control, donde se lee 'END9 cl:1096' junto a los valores de exposición activos en el panel.</w:t>
             </w:r>
           </w:p>
         </w:tc>
@@ -2236,7 +2248,7 @@
               </w:rPr>
               <w:drawing>
                 <wp:inline xmlns:a="http://schemas.openxmlformats.org/drawingml/2006/main" xmlns:pic="http://schemas.openxmlformats.org/drawingml/2006/picture">
-                  <wp:extent cx="2991690" cy="5318560"/>
+                  <wp:extent cx="3081701" cy="5478580"/>
                   <wp:docPr id="10" name="Picture 10"/>
                   <wp:cNvGraphicFramePr>
                     <a:graphicFrameLocks noChangeAspect="1"/>
@@ -2245,7 +2257,7 @@
                     <a:graphicData uri="http://schemas.openxmlformats.org/drawingml/2006/picture">
                       <pic:pic>
                         <pic:nvPicPr>
-                          <pic:cNvPr id="0" name="10_02-48_anotada.jpg"/>
+                          <pic:cNvPr id="0" name="10_02-41_anotada.jpg"/>
                           <pic:cNvPicPr/>
                         </pic:nvPicPr>
                         <pic:blipFill>
@@ -2257,7 +2269,7 @@
                         <pic:spPr>
                           <a:xfrm>
                             <a:off x="0" y="0"/>
-                            <a:ext cx="2991690" cy="5318560"/>
+                            <a:ext cx="3081701" cy="5478580"/>
                           </a:xfrm>
                           <a:prstGeom prst="rect"/>
                         </pic:spPr>
@@ -2279,7 +2291,7 @@
                 <w:color w:val="666666"/>
                 <w:sz w:val="17"/>
               </w:rPr>
-              <w:t>PASO 10 · ADQUISICIÓN DE IMAGEN · 02:48</w:t>
+              <w:t>PASO 10 · POSICIONAMIENTO DEL PACIENTE · 02:41</w:t>
             </w:r>
           </w:p>
           <w:p>
@@ -2293,7 +2305,7 @@
                 <w:color w:val="111111"/>
                 <w:sz w:val="26"/>
               </w:rPr>
-              <w:t>Revisar los parámetros en la pantalla</w:t>
+              <w:t>Definir trayectoria de aproximación</w:t>
             </w:r>
           </w:p>
           <w:p>
@@ -2307,7 +2319,7 @@
                 <w:color w:val="222222"/>
                 <w:sz w:val="21"/>
               </w:rPr>
-              <w:t>Se observan en la pantalla de control los parámetros de examen seleccionados; se visualizan valores como 41 kV, 0.060 L 1.44 mA, modo Abdominal, 1/2 dosis, 17 cm, 3 s de velocidad de Fluoro y el identificador END9 cl-1096.</w:t>
+              <w:t>Se planifica y verifica la entrada del arco en C hacia el paciente, señalando el pedal de disparo en el suelo para evitar obstáculos con los cables.</w:t>
             </w:r>
           </w:p>
         </w:tc>
@@ -2341,7 +2353,7 @@
           <w:sz w:val="16"/>
         </w:rPr>
         <w:tab/>
-        <w:t>Pasos 11–12 de 13</w:t>
+        <w:t>Pasos 11–12 de 12</w:t>
       </w:r>
     </w:p>
     <w:tbl>
@@ -2393,7 +2405,7 @@
                     <a:graphicData uri="http://schemas.openxmlformats.org/drawingml/2006/picture">
                       <pic:pic>
                         <pic:nvPicPr>
-                          <pic:cNvPr id="0" name="11_03-08.jpg"/>
+                          <pic:cNvPr id="0" name="11_03-08_anotada.jpg"/>
                           <pic:cNvPicPr/>
                         </pic:nvPicPr>
                         <pic:blipFill>
@@ -2441,7 +2453,7 @@
                 <w:color w:val="111111"/>
                 <w:sz w:val="26"/>
               </w:rPr>
-              <w:t>Monitorear la inserción del catéter</w:t>
+              <w:t>Monitorear adquisición en tiempo real</w:t>
             </w:r>
           </w:p>
           <w:p>
@@ -2455,7 +2467,7 @@
                 <w:color w:val="222222"/>
                 <w:sz w:val="21"/>
               </w:rPr>
-              <w:t>El equipo médico visualiza en el monitor en tiempo real el avance y la posición de la punta del catéter doble J.</w:t>
+              <w:t>Durante la inserción del catéter, los cirujanos controlan visualmente la posición a través del monitor del sistema de fluoroscopia.</w:t>
             </w:r>
           </w:p>
         </w:tc>
@@ -2487,7 +2499,7 @@
                     <a:graphicData uri="http://schemas.openxmlformats.org/drawingml/2006/picture">
                       <pic:pic>
                         <pic:nvPicPr>
-                          <pic:cNvPr id="0" name="12_03-44_anotada.jpg"/>
+                          <pic:cNvPr id="0" name="12_04-02_anotada.jpg"/>
                           <pic:cNvPicPr/>
                         </pic:nvPicPr>
                         <pic:blipFill>
@@ -2521,7 +2533,7 @@
                 <w:color w:val="666666"/>
                 <w:sz w:val="17"/>
               </w:rPr>
-              <w:t>PASO 12 · APAGADO Y LIMPIEZA · 03:44</w:t>
+              <w:t>PASO 12 · APAGADO Y DESCONEXIÓN · 04:02</w:t>
             </w:r>
           </w:p>
           <w:p>
@@ -2535,7 +2547,7 @@
                 <w:color w:val="111111"/>
                 <w:sz w:val="26"/>
               </w:rPr>
-              <w:t>Apagar el sistema al finalizar</w:t>
+              <w:t>Desconectar cables tras finalizar procedimiento</w:t>
             </w:r>
           </w:p>
           <w:p>
@@ -2549,7 +2561,7 @@
                 <w:color w:val="222222"/>
                 <w:sz w:val="21"/>
               </w:rPr>
-              <w:t>Se presiona el botón con el icono de un círculo de apagado ubicado en la esquina superior izquierda del teclado del panel de control del arco en C, al lado del botón verde.</w:t>
+              <w:t>Se retiran las conexiones eléctricas y de datos en la pared una vez finalizado el examen para proceder al guardado del equipo.</w:t>
             </w:r>
           </w:p>
         </w:tc>
@@ -2583,133 +2595,863 @@
           <w:sz w:val="16"/>
         </w:rPr>
         <w:tab/>
-        <w:t>Paso 13 de 13</w:t>
+        <w:t>Transcripción</w:t>
       </w:r>
     </w:p>
-    <w:tbl>
-      <w:tblPr>
-        <w:tblW w:type="auto" w:w="0"/>
-        <w:jc w:val="center"/>
-        <w:tblLayout w:type="fixed"/>
-        <w:tblCellMar>
-          <w:top w:w="28" w:type="dxa"/>
-          <w:left w:w="85" w:type="dxa"/>
-          <w:bottom w:w="0" w:type="dxa"/>
-          <w:right w:w="85" w:type="dxa"/>
-        </w:tblCellMar>
-        <w:tblLook w:firstColumn="1" w:firstRow="1" w:lastColumn="0" w:lastRow="0" w:noHBand="0" w:noVBand="1" w:val="04A0"/>
-      </w:tblPr>
-      <w:tblGrid>
-        <w:gridCol w:w="7852"/>
-        <w:gridCol w:w="7852"/>
-      </w:tblGrid>
-      <w:tr>
-        <w:trPr>
-          <w:trHeight w:val="10148" w:hRule="exact"/>
-        </w:trPr>
-        <w:tc>
-          <w:tcPr>
-            <w:tcW w:type="dxa" w:w="7710"/>
-            <w:vAlign w:val="top"/>
-          </w:tcPr>
-          <w:p>
-            <w:pPr>
-              <w:spacing w:before="0" w:after="40" w:line="240" w:lineRule="auto"/>
-              <w:jc w:val="left"/>
-              <w:rPr>
-                <w:sz w:val="4"/>
-              </w:rPr>
-            </w:pPr>
-            <w:r>
-              <w:rPr>
-                <w:sz w:val="4"/>
-              </w:rPr>
-              <w:drawing>
-                <wp:inline xmlns:a="http://schemas.openxmlformats.org/drawingml/2006/main" xmlns:pic="http://schemas.openxmlformats.org/drawingml/2006/picture">
-                  <wp:extent cx="3081701" cy="5478580"/>
-                  <wp:docPr id="13" name="Picture 13"/>
-                  <wp:cNvGraphicFramePr>
-                    <a:graphicFrameLocks noChangeAspect="1"/>
-                  </wp:cNvGraphicFramePr>
-                  <a:graphic>
-                    <a:graphicData uri="http://schemas.openxmlformats.org/drawingml/2006/picture">
-                      <pic:pic>
-                        <pic:nvPicPr>
-                          <pic:cNvPr id="0" name="13_04-03_anotada.jpg"/>
-                          <pic:cNvPicPr/>
-                        </pic:nvPicPr>
-                        <pic:blipFill>
-                          <a:blip r:embed="rId22"/>
-                          <a:stretch>
-                            <a:fillRect/>
-                          </a:stretch>
-                        </pic:blipFill>
-                        <pic:spPr>
-                          <a:xfrm>
-                            <a:off x="0" y="0"/>
-                            <a:ext cx="3081701" cy="5478580"/>
-                          </a:xfrm>
-                          <a:prstGeom prst="rect"/>
-                        </pic:spPr>
-                      </pic:pic>
-                    </a:graphicData>
-                  </a:graphic>
-                </wp:inline>
-              </w:drawing>
-            </w:r>
-          </w:p>
-          <w:p>
-            <w:pPr>
-              <w:spacing w:before="0" w:after="20" w:line="204" w:lineRule="exact"/>
-            </w:pPr>
-            <w:r>
-              <w:rPr>
-                <w:b w:val="0"/>
-                <w:i w:val="0"/>
-                <w:color w:val="666666"/>
-                <w:sz w:val="17"/>
-              </w:rPr>
-              <w:t>PASO 13 · APAGADO Y LIMPIEZA · 04:03</w:t>
-            </w:r>
-          </w:p>
-          <w:p>
-            <w:pPr>
-              <w:spacing w:before="0" w:after="20" w:line="312" w:lineRule="exact"/>
-            </w:pPr>
-            <w:r>
-              <w:rPr>
-                <w:b/>
-                <w:i w:val="0"/>
-                <w:color w:val="111111"/>
-                <w:sz w:val="26"/>
-              </w:rPr>
-              <w:t>Desconectar los cables de alimentación</w:t>
-            </w:r>
-          </w:p>
-          <w:p>
-            <w:pPr>
-              <w:spacing w:before="0" w:after="0" w:line="252" w:lineRule="exact"/>
-            </w:pPr>
-            <w:r>
-              <w:rPr>
-                <w:b w:val="0"/>
-                <w:i w:val="0"/>
-                <w:color w:val="222222"/>
-                <w:sz w:val="21"/>
-              </w:rPr>
-              <w:t>Se procede a desenchufar y enrollar cuidadosamente los cables de red y de conexión entre el arco y el carro de monitores.</w:t>
-            </w:r>
-          </w:p>
-        </w:tc>
-        <w:tc>
-          <w:tcPr>
-            <w:tcW w:type="dxa" w:w="7710"/>
-            <w:vAlign w:val="top"/>
-          </w:tcPr>
-          <w:p/>
-        </w:tc>
-      </w:tr>
-    </w:tbl>
+    <w:p>
+      <w:pPr>
+        <w:spacing w:before="0" w:after="280" w:line="432" w:lineRule="exact"/>
+      </w:pPr>
+      <w:r>
+        <w:rPr>
+          <w:b/>
+          <w:i w:val="0"/>
+          <w:color w:val="111111"/>
+          <w:sz w:val="36"/>
+        </w:rPr>
+        <w:t>Transcripción del audio</w:t>
+      </w:r>
+    </w:p>
+    <w:p>
+      <w:pPr>
+        <w:tabs>
+          <w:tab w:pos="850" w:val="left"/>
+        </w:tabs>
+        <w:spacing w:before="0" w:after="60" w:line="228" w:lineRule="exact"/>
+        <w:ind w:left="850" w:hanging="850"/>
+      </w:pPr>
+      <w:r>
+        <w:rPr>
+          <w:b w:val="0"/>
+          <w:i w:val="0"/>
+          <w:color w:val="666666"/>
+          <w:sz w:val="19"/>
+        </w:rPr>
+        <w:t>00:01</w:t>
+        <w:tab/>
+      </w:r>
+      <w:r>
+        <w:rPr>
+          <w:b w:val="0"/>
+          <w:i w:val="0"/>
+          <w:color w:val="222222"/>
+          <w:sz w:val="19"/>
+        </w:rPr>
+        <w:t>El movimiento... como que... horizontal... o sea, ese es como el movimiento...</w:t>
+      </w:r>
+    </w:p>
+    <w:p>
+      <w:pPr>
+        <w:tabs>
+          <w:tab w:pos="850" w:val="left"/>
+        </w:tabs>
+        <w:spacing w:before="0" w:after="60" w:line="228" w:lineRule="exact"/>
+        <w:ind w:left="850" w:hanging="850"/>
+      </w:pPr>
+      <w:r>
+        <w:rPr>
+          <w:b w:val="0"/>
+          <w:i w:val="0"/>
+          <w:color w:val="666666"/>
+          <w:sz w:val="19"/>
+        </w:rPr>
+        <w:t>00:10</w:t>
+        <w:tab/>
+      </w:r>
+      <w:r>
+        <w:rPr>
+          <w:b w:val="0"/>
+          <w:i w:val="0"/>
+          <w:color w:val="222222"/>
+          <w:sz w:val="19"/>
+        </w:rPr>
+        <w:t>Ah, ya, una rotación en torno a este eje.</w:t>
+      </w:r>
+    </w:p>
+    <w:p>
+      <w:pPr>
+        <w:tabs>
+          <w:tab w:pos="850" w:val="left"/>
+        </w:tabs>
+        <w:spacing w:before="0" w:after="60" w:line="228" w:lineRule="exact"/>
+        <w:ind w:left="850" w:hanging="850"/>
+      </w:pPr>
+      <w:r>
+        <w:rPr>
+          <w:b w:val="0"/>
+          <w:i w:val="0"/>
+          <w:color w:val="666666"/>
+          <w:sz w:val="19"/>
+        </w:rPr>
+        <w:t>00:12</w:t>
+        <w:tab/>
+      </w:r>
+      <w:r>
+        <w:rPr>
+          <w:b w:val="0"/>
+          <w:i w:val="0"/>
+          <w:color w:val="222222"/>
+          <w:sz w:val="19"/>
+        </w:rPr>
+        <w:t>...horizontal, pero sin... como un movimiento completo del tubo. Sí. Sin... o sea, sin mover... pero, como movimiento completo del arco en C, sí.</w:t>
+      </w:r>
+    </w:p>
+    <w:p>
+      <w:pPr>
+        <w:tabs>
+          <w:tab w:pos="850" w:val="left"/>
+        </w:tabs>
+        <w:spacing w:before="0" w:after="60" w:line="228" w:lineRule="exact"/>
+        <w:ind w:left="850" w:hanging="850"/>
+      </w:pPr>
+      <w:r>
+        <w:rPr>
+          <w:b w:val="0"/>
+          <w:i w:val="0"/>
+          <w:color w:val="666666"/>
+          <w:sz w:val="19"/>
+        </w:rPr>
+        <w:t>00:23</w:t>
+        <w:tab/>
+      </w:r>
+      <w:r>
+        <w:rPr>
+          <w:b w:val="0"/>
+          <w:i w:val="0"/>
+          <w:color w:val="222222"/>
+          <w:sz w:val="19"/>
+        </w:rPr>
+        <w:t>Y ese lo bloqueas con esto.</w:t>
+      </w:r>
+    </w:p>
+    <w:p>
+      <w:pPr>
+        <w:tabs>
+          <w:tab w:pos="850" w:val="left"/>
+        </w:tabs>
+        <w:spacing w:before="0" w:after="60" w:line="228" w:lineRule="exact"/>
+        <w:ind w:left="850" w:hanging="850"/>
+      </w:pPr>
+      <w:r>
+        <w:rPr>
+          <w:b w:val="0"/>
+          <w:i w:val="0"/>
+          <w:color w:val="666666"/>
+          <w:sz w:val="19"/>
+        </w:rPr>
+        <w:t>00:26</w:t>
+        <w:tab/>
+      </w:r>
+      <w:r>
+        <w:rPr>
+          <w:b w:val="0"/>
+          <w:i w:val="0"/>
+          <w:color w:val="222222"/>
+          <w:sz w:val="19"/>
+        </w:rPr>
+        <w:t>Sí. Claro.</w:t>
+      </w:r>
+    </w:p>
+    <w:p>
+      <w:pPr>
+        <w:tabs>
+          <w:tab w:pos="850" w:val="left"/>
+        </w:tabs>
+        <w:spacing w:before="0" w:after="60" w:line="228" w:lineRule="exact"/>
+        <w:ind w:left="850" w:hanging="850"/>
+      </w:pPr>
+      <w:r>
+        <w:rPr>
+          <w:b w:val="0"/>
+          <w:i w:val="0"/>
+          <w:color w:val="666666"/>
+          <w:sz w:val="19"/>
+        </w:rPr>
+        <w:t>00:31</w:t>
+        <w:tab/>
+      </w:r>
+      <w:r>
+        <w:rPr>
+          <w:b w:val="0"/>
+          <w:i w:val="0"/>
+          <w:color w:val="222222"/>
+          <w:sz w:val="19"/>
+        </w:rPr>
+        <w:t>¿Y el otro? Ah, bueno.</w:t>
+      </w:r>
+    </w:p>
+    <w:p>
+      <w:pPr>
+        <w:tabs>
+          <w:tab w:pos="850" w:val="left"/>
+        </w:tabs>
+        <w:spacing w:before="0" w:after="60" w:line="228" w:lineRule="exact"/>
+        <w:ind w:left="850" w:hanging="850"/>
+      </w:pPr>
+      <w:r>
+        <w:rPr>
+          <w:b w:val="0"/>
+          <w:i w:val="0"/>
+          <w:color w:val="666666"/>
+          <w:sz w:val="19"/>
+        </w:rPr>
+        <w:t>00:35</w:t>
+        <w:tab/>
+      </w:r>
+      <w:r>
+        <w:rPr>
+          <w:b w:val="0"/>
+          <w:i w:val="0"/>
+          <w:color w:val="222222"/>
+          <w:sz w:val="19"/>
+        </w:rPr>
+        <w:t>Claro. Súper.</w:t>
+      </w:r>
+    </w:p>
+    <w:p>
+      <w:pPr>
+        <w:tabs>
+          <w:tab w:pos="850" w:val="left"/>
+        </w:tabs>
+        <w:spacing w:before="0" w:after="60" w:line="228" w:lineRule="exact"/>
+        <w:ind w:left="850" w:hanging="850"/>
+      </w:pPr>
+      <w:r>
+        <w:rPr>
+          <w:b w:val="0"/>
+          <w:i w:val="0"/>
+          <w:color w:val="666666"/>
+          <w:sz w:val="19"/>
+        </w:rPr>
+        <w:t>00:40</w:t>
+        <w:tab/>
+      </w:r>
+      <w:r>
+        <w:rPr>
+          <w:b w:val="0"/>
+          <w:i w:val="0"/>
+          <w:color w:val="222222"/>
+          <w:sz w:val="19"/>
+        </w:rPr>
+        <w:t>Pero acá, generalmente, no tenemos ángulo. Podríamos darle un poco de ángulo... eh... acá.</w:t>
+      </w:r>
+    </w:p>
+    <w:p>
+      <w:pPr>
+        <w:tabs>
+          <w:tab w:pos="850" w:val="left"/>
+        </w:tabs>
+        <w:spacing w:before="0" w:after="60" w:line="228" w:lineRule="exact"/>
+        <w:ind w:left="850" w:hanging="850"/>
+      </w:pPr>
+      <w:r>
+        <w:rPr>
+          <w:b w:val="0"/>
+          <w:i w:val="0"/>
+          <w:color w:val="666666"/>
+          <w:sz w:val="19"/>
+        </w:rPr>
+        <w:t>00:50</w:t>
+        <w:tab/>
+      </w:r>
+      <w:r>
+        <w:rPr>
+          <w:b w:val="0"/>
+          <w:i w:val="0"/>
+          <w:color w:val="222222"/>
+          <w:sz w:val="19"/>
+        </w:rPr>
+        <w:t>Súper. Perdón, era el otro.</w:t>
+      </w:r>
+    </w:p>
+    <w:p>
+      <w:pPr>
+        <w:tabs>
+          <w:tab w:pos="850" w:val="left"/>
+        </w:tabs>
+        <w:spacing w:before="0" w:after="60" w:line="228" w:lineRule="exact"/>
+        <w:ind w:left="850" w:hanging="850"/>
+      </w:pPr>
+      <w:r>
+        <w:rPr>
+          <w:b w:val="0"/>
+          <w:i w:val="0"/>
+          <w:color w:val="666666"/>
+          <w:sz w:val="19"/>
+        </w:rPr>
+        <w:t>01:01</w:t>
+        <w:tab/>
+      </w:r>
+      <w:r>
+        <w:rPr>
+          <w:b w:val="0"/>
+          <w:i w:val="0"/>
+          <w:color w:val="222222"/>
+          <w:sz w:val="19"/>
+        </w:rPr>
+        <w:t>Si es que no pudiéramos ver una... como... si no pudiéramos ver detalladamente la bifurcación renal, tal vez podríamos un poquito angular.</w:t>
+      </w:r>
+    </w:p>
+    <w:p>
+      <w:pPr>
+        <w:tabs>
+          <w:tab w:pos="850" w:val="left"/>
+        </w:tabs>
+        <w:spacing w:before="0" w:after="60" w:line="228" w:lineRule="exact"/>
+        <w:ind w:left="850" w:hanging="850"/>
+      </w:pPr>
+      <w:r>
+        <w:rPr>
+          <w:b w:val="0"/>
+          <w:i w:val="0"/>
+          <w:color w:val="666666"/>
+          <w:sz w:val="19"/>
+        </w:rPr>
+        <w:t>01:09</w:t>
+        <w:tab/>
+      </w:r>
+      <w:r>
+        <w:rPr>
+          <w:b w:val="0"/>
+          <w:i w:val="0"/>
+          <w:color w:val="222222"/>
+          <w:sz w:val="19"/>
+        </w:rPr>
+        <w:t>Pero, generalmente, el... la cavidad abdominal, por lo menos en este caso... la zona renal, cara renal, no... no lo vamos a necesitar tanto. No.</w:t>
+      </w:r>
+    </w:p>
+    <w:p>
+      <w:pPr>
+        <w:tabs>
+          <w:tab w:pos="850" w:val="left"/>
+        </w:tabs>
+        <w:spacing w:before="0" w:after="60" w:line="228" w:lineRule="exact"/>
+        <w:ind w:left="850" w:hanging="850"/>
+      </w:pPr>
+      <w:r>
+        <w:rPr>
+          <w:b w:val="0"/>
+          <w:i w:val="0"/>
+          <w:color w:val="666666"/>
+          <w:sz w:val="19"/>
+        </w:rPr>
+        <w:t>01:20</w:t>
+        <w:tab/>
+      </w:r>
+      <w:r>
+        <w:rPr>
+          <w:b w:val="0"/>
+          <w:i w:val="0"/>
+          <w:color w:val="222222"/>
+          <w:sz w:val="19"/>
+        </w:rPr>
+        <w:t>Y, así, los delantales plomados, ahora que está todo listo.</w:t>
+      </w:r>
+    </w:p>
+    <w:p>
+      <w:pPr>
+        <w:tabs>
+          <w:tab w:pos="850" w:val="left"/>
+        </w:tabs>
+        <w:spacing w:before="0" w:after="60" w:line="228" w:lineRule="exact"/>
+        <w:ind w:left="850" w:hanging="850"/>
+      </w:pPr>
+      <w:r>
+        <w:rPr>
+          <w:b w:val="0"/>
+          <w:i w:val="0"/>
+          <w:color w:val="666666"/>
+          <w:sz w:val="19"/>
+        </w:rPr>
+        <w:t>01:25</w:t>
+        <w:tab/>
+      </w:r>
+      <w:r>
+        <w:rPr>
+          <w:b w:val="0"/>
+          <w:i w:val="0"/>
+          <w:color w:val="222222"/>
+          <w:sz w:val="19"/>
+        </w:rPr>
+        <w:t>Están acá.</w:t>
+      </w:r>
+    </w:p>
+    <w:p>
+      <w:pPr>
+        <w:tabs>
+          <w:tab w:pos="850" w:val="left"/>
+        </w:tabs>
+        <w:spacing w:before="0" w:after="60" w:line="228" w:lineRule="exact"/>
+        <w:ind w:left="850" w:hanging="850"/>
+      </w:pPr>
+      <w:r>
+        <w:rPr>
+          <w:b w:val="0"/>
+          <w:i w:val="0"/>
+          <w:color w:val="666666"/>
+          <w:sz w:val="19"/>
+        </w:rPr>
+        <w:t>01:28</w:t>
+        <w:tab/>
+      </w:r>
+      <w:r>
+        <w:rPr>
+          <w:b w:val="0"/>
+          <w:i w:val="0"/>
+          <w:color w:val="222222"/>
+          <w:sz w:val="19"/>
+        </w:rPr>
+        <w:t>Aquí se ponen... lo que hay de insumo para ahí.</w:t>
+      </w:r>
+    </w:p>
+    <w:p>
+      <w:pPr>
+        <w:tabs>
+          <w:tab w:pos="850" w:val="left"/>
+        </w:tabs>
+        <w:spacing w:before="0" w:after="60" w:line="228" w:lineRule="exact"/>
+        <w:ind w:left="850" w:hanging="850"/>
+      </w:pPr>
+      <w:r>
+        <w:rPr>
+          <w:b w:val="0"/>
+          <w:i w:val="0"/>
+          <w:color w:val="666666"/>
+          <w:sz w:val="19"/>
+        </w:rPr>
+        <w:t>01:38</w:t>
+        <w:tab/>
+      </w:r>
+      <w:r>
+        <w:rPr>
+          <w:b w:val="0"/>
+          <w:i w:val="0"/>
+          <w:color w:val="222222"/>
+          <w:sz w:val="19"/>
+        </w:rPr>
+        <w:t>Si es que... si es que se empuja el arco, la otra cámara.</w:t>
+      </w:r>
+    </w:p>
+    <w:p>
+      <w:pPr>
+        <w:tabs>
+          <w:tab w:pos="850" w:val="left"/>
+        </w:tabs>
+        <w:spacing w:before="0" w:after="60" w:line="228" w:lineRule="exact"/>
+        <w:ind w:left="850" w:hanging="850"/>
+      </w:pPr>
+      <w:r>
+        <w:rPr>
+          <w:b w:val="0"/>
+          <w:i w:val="0"/>
+          <w:color w:val="666666"/>
+          <w:sz w:val="19"/>
+        </w:rPr>
+        <w:t>01:43</w:t>
+        <w:tab/>
+      </w:r>
+      <w:r>
+        <w:rPr>
+          <w:b w:val="0"/>
+          <w:i w:val="0"/>
+          <w:color w:val="222222"/>
+          <w:sz w:val="19"/>
+        </w:rPr>
+        <w:t>Entonces, se desplaza... se desplaza así. Se aprieta y se desplaza a la vez. Súper.</w:t>
+      </w:r>
+    </w:p>
+    <w:p>
+      <w:pPr>
+        <w:tabs>
+          <w:tab w:pos="850" w:val="left"/>
+        </w:tabs>
+        <w:spacing w:before="0" w:after="60" w:line="228" w:lineRule="exact"/>
+        <w:ind w:left="850" w:hanging="850"/>
+      </w:pPr>
+      <w:r>
+        <w:rPr>
+          <w:b w:val="0"/>
+          <w:i w:val="0"/>
+          <w:color w:val="666666"/>
+          <w:sz w:val="19"/>
+        </w:rPr>
+        <w:t>01:47</w:t>
+        <w:tab/>
+      </w:r>
+      <w:r>
+        <w:rPr>
+          <w:b w:val="0"/>
+          <w:i w:val="0"/>
+          <w:color w:val="222222"/>
+          <w:sz w:val="19"/>
+        </w:rPr>
+        <w:t>¿Se aprieta de allá? Ya. Se desplaza de allá porque... las de... las de otras son automáticas. Sí, son automáticas.</w:t>
+      </w:r>
+    </w:p>
+    <w:p>
+      <w:pPr>
+        <w:tabs>
+          <w:tab w:pos="850" w:val="left"/>
+        </w:tabs>
+        <w:spacing w:before="0" w:after="60" w:line="228" w:lineRule="exact"/>
+        <w:ind w:left="850" w:hanging="850"/>
+      </w:pPr>
+      <w:r>
+        <w:rPr>
+          <w:b w:val="0"/>
+          <w:i w:val="0"/>
+          <w:color w:val="666666"/>
+          <w:sz w:val="19"/>
+        </w:rPr>
+        <w:t>01:54</w:t>
+        <w:tab/>
+      </w:r>
+      <w:r>
+        <w:rPr>
+          <w:b w:val="0"/>
+          <w:i w:val="0"/>
+          <w:color w:val="222222"/>
+          <w:sz w:val="19"/>
+        </w:rPr>
+        <w:t>Entonces, la fonoaudióloga le puso esto para proteger y está estéril. Y tú le pusiste acá este papelito para que no se sobe... para que no se... No.</w:t>
+      </w:r>
+    </w:p>
+    <w:p>
+      <w:pPr>
+        <w:tabs>
+          <w:tab w:pos="850" w:val="left"/>
+        </w:tabs>
+        <w:spacing w:before="0" w:after="60" w:line="228" w:lineRule="exact"/>
+        <w:ind w:left="850" w:hanging="850"/>
+      </w:pPr>
+      <w:r>
+        <w:rPr>
+          <w:b w:val="0"/>
+          <w:i w:val="0"/>
+          <w:color w:val="666666"/>
+          <w:sz w:val="19"/>
+        </w:rPr>
+        <w:t>02:09</w:t>
+        <w:tab/>
+      </w:r>
+      <w:r>
+        <w:rPr>
+          <w:b w:val="0"/>
+          <w:i w:val="0"/>
+          <w:color w:val="222222"/>
+          <w:sz w:val="19"/>
+        </w:rPr>
+        <w:t>¿Y, Pancho, y este doblez lo hace adrede de algo?</w:t>
+      </w:r>
+    </w:p>
+    <w:p>
+      <w:pPr>
+        <w:tabs>
+          <w:tab w:pos="850" w:val="left"/>
+        </w:tabs>
+        <w:spacing w:before="0" w:after="60" w:line="228" w:lineRule="exact"/>
+        <w:ind w:left="850" w:hanging="850"/>
+      </w:pPr>
+      <w:r>
+        <w:rPr>
+          <w:b w:val="0"/>
+          <w:i w:val="0"/>
+          <w:color w:val="666666"/>
+          <w:sz w:val="19"/>
+        </w:rPr>
+        <w:t>02:14</w:t>
+        <w:tab/>
+      </w:r>
+      <w:r>
+        <w:rPr>
+          <w:b w:val="0"/>
+          <w:i w:val="0"/>
+          <w:color w:val="222222"/>
+          <w:sz w:val="19"/>
+        </w:rPr>
+        <w:t>¿Mmm? ¿Cómo? ¿Cuál?</w:t>
+      </w:r>
+    </w:p>
+    <w:p>
+      <w:pPr>
+        <w:tabs>
+          <w:tab w:pos="850" w:val="left"/>
+        </w:tabs>
+        <w:spacing w:before="0" w:after="60" w:line="228" w:lineRule="exact"/>
+        <w:ind w:left="850" w:hanging="850"/>
+      </w:pPr>
+      <w:r>
+        <w:rPr>
+          <w:b w:val="0"/>
+          <w:i w:val="0"/>
+          <w:color w:val="666666"/>
+          <w:sz w:val="19"/>
+        </w:rPr>
+        <w:t>02:17</w:t>
+        <w:tab/>
+      </w:r>
+      <w:r>
+        <w:rPr>
+          <w:b w:val="0"/>
+          <w:i w:val="0"/>
+          <w:color w:val="222222"/>
+          <w:sz w:val="19"/>
+        </w:rPr>
+        <w:t>Ese doblez que le hace acá... ese es un doblez. ¿Mmm? ¿Sí? ¿Es por algo o es... lo hizo...?</w:t>
+      </w:r>
+    </w:p>
+    <w:p>
+      <w:pPr>
+        <w:tabs>
+          <w:tab w:pos="850" w:val="left"/>
+        </w:tabs>
+        <w:spacing w:before="0" w:after="60" w:line="228" w:lineRule="exact"/>
+        <w:ind w:left="850" w:hanging="850"/>
+      </w:pPr>
+      <w:r>
+        <w:rPr>
+          <w:b w:val="0"/>
+          <w:i w:val="0"/>
+          <w:color w:val="666666"/>
+          <w:sz w:val="19"/>
+        </w:rPr>
+        <w:t>02:22</w:t>
+        <w:tab/>
+      </w:r>
+      <w:r>
+        <w:rPr>
+          <w:b w:val="0"/>
+          <w:i w:val="0"/>
+          <w:color w:val="222222"/>
+          <w:sz w:val="19"/>
+        </w:rPr>
+        <w:t>No, no, no, para acomodarlo más. Ah, listo. No, para que pueda caber en el espacio de allá. Ya, súper.</w:t>
+      </w:r>
+    </w:p>
+    <w:p>
+      <w:pPr>
+        <w:tabs>
+          <w:tab w:pos="850" w:val="left"/>
+        </w:tabs>
+        <w:spacing w:before="0" w:after="60" w:line="228" w:lineRule="exact"/>
+        <w:ind w:left="850" w:hanging="850"/>
+      </w:pPr>
+      <w:r>
+        <w:rPr>
+          <w:b w:val="0"/>
+          <w:i w:val="0"/>
+          <w:color w:val="666666"/>
+          <w:sz w:val="19"/>
+        </w:rPr>
+        <w:t>02:28</w:t>
+        <w:tab/>
+      </w:r>
+      <w:r>
+        <w:rPr>
+          <w:b w:val="0"/>
+          <w:i w:val="0"/>
+          <w:color w:val="222222"/>
+          <w:sz w:val="19"/>
+        </w:rPr>
+        <w:t>Están explicando que hay que entrar por acá como para que tengan habilitado el espacio, sí. Ah, ya.</w:t>
+      </w:r>
+    </w:p>
+    <w:p>
+      <w:pPr>
+        <w:tabs>
+          <w:tab w:pos="850" w:val="left"/>
+        </w:tabs>
+        <w:spacing w:before="0" w:after="60" w:line="228" w:lineRule="exact"/>
+        <w:ind w:left="850" w:hanging="850"/>
+      </w:pPr>
+      <w:r>
+        <w:rPr>
+          <w:b w:val="0"/>
+          <w:i w:val="0"/>
+          <w:color w:val="666666"/>
+          <w:sz w:val="19"/>
+        </w:rPr>
+        <w:t>02:35</w:t>
+        <w:tab/>
+      </w:r>
+      <w:r>
+        <w:rPr>
+          <w:b w:val="0"/>
+          <w:i w:val="0"/>
+          <w:color w:val="222222"/>
+          <w:sz w:val="19"/>
+        </w:rPr>
+        <w:t>O sea...</w:t>
+      </w:r>
+    </w:p>
+    <w:p>
+      <w:pPr>
+        <w:tabs>
+          <w:tab w:pos="850" w:val="left"/>
+        </w:tabs>
+        <w:spacing w:before="0" w:after="60" w:line="228" w:lineRule="exact"/>
+        <w:ind w:left="850" w:hanging="850"/>
+      </w:pPr>
+      <w:r>
+        <w:rPr>
+          <w:b w:val="0"/>
+          <w:i w:val="0"/>
+          <w:color w:val="666666"/>
+          <w:sz w:val="19"/>
+        </w:rPr>
+        <w:t>02:39</w:t>
+        <w:tab/>
+      </w:r>
+      <w:r>
+        <w:rPr>
+          <w:b w:val="0"/>
+          <w:i w:val="0"/>
+          <w:color w:val="222222"/>
+          <w:sz w:val="19"/>
+        </w:rPr>
+        <w:t>Acá, sí. Se va a entrar por acá, con el... con esto. Se va a entrar directo así o... No.</w:t>
+      </w:r>
+    </w:p>
+    <w:p>
+      <w:pPr>
+        <w:tabs>
+          <w:tab w:pos="850" w:val="left"/>
+        </w:tabs>
+        <w:spacing w:before="0" w:after="60" w:line="228" w:lineRule="exact"/>
+        <w:ind w:left="850" w:hanging="850"/>
+      </w:pPr>
+      <w:r>
+        <w:rPr>
+          <w:b w:val="0"/>
+          <w:i w:val="0"/>
+          <w:color w:val="666666"/>
+          <w:sz w:val="19"/>
+        </w:rPr>
+        <w:t>03:07</w:t>
+        <w:tab/>
+      </w:r>
+      <w:r>
+        <w:rPr>
+          <w:b w:val="0"/>
+          <w:i w:val="0"/>
+          <w:color w:val="222222"/>
+          <w:sz w:val="19"/>
+        </w:rPr>
+        <w:t>¿Esa cámara está en la punta de ese catéter?</w:t>
+      </w:r>
+    </w:p>
+    <w:p>
+      <w:pPr>
+        <w:tabs>
+          <w:tab w:pos="850" w:val="left"/>
+        </w:tabs>
+        <w:spacing w:before="0" w:after="60" w:line="228" w:lineRule="exact"/>
+        <w:ind w:left="850" w:hanging="850"/>
+      </w:pPr>
+      <w:r>
+        <w:rPr>
+          <w:b w:val="0"/>
+          <w:i w:val="0"/>
+          <w:color w:val="666666"/>
+          <w:sz w:val="19"/>
+        </w:rPr>
+        <w:t>03:10</w:t>
+        <w:tab/>
+      </w:r>
+      <w:r>
+        <w:rPr>
+          <w:b w:val="0"/>
+          <w:i w:val="0"/>
+          <w:color w:val="222222"/>
+          <w:sz w:val="19"/>
+        </w:rPr>
+        <w:t>Sí. Ah, ya.</w:t>
+      </w:r>
+    </w:p>
+    <w:p>
+      <w:pPr>
+        <w:tabs>
+          <w:tab w:pos="850" w:val="left"/>
+        </w:tabs>
+        <w:spacing w:before="0" w:after="60" w:line="228" w:lineRule="exact"/>
+        <w:ind w:left="850" w:hanging="850"/>
+      </w:pPr>
+      <w:r>
+        <w:rPr>
+          <w:b w:val="0"/>
+          <w:i w:val="0"/>
+          <w:color w:val="666666"/>
+          <w:sz w:val="19"/>
+        </w:rPr>
+        <w:t>03:31</w:t>
+        <w:tab/>
+      </w:r>
+      <w:r>
+        <w:rPr>
+          <w:b w:val="0"/>
+          <w:i w:val="0"/>
+          <w:color w:val="222222"/>
+          <w:sz w:val="19"/>
+        </w:rPr>
+        <w:t>Entonces, la de abajo...</w:t>
+      </w:r>
+    </w:p>
+    <w:p>
+      <w:pPr>
+        <w:tabs>
+          <w:tab w:pos="850" w:val="left"/>
+        </w:tabs>
+        <w:spacing w:before="0" w:after="60" w:line="228" w:lineRule="exact"/>
+        <w:ind w:left="850" w:hanging="850"/>
+      </w:pPr>
+      <w:r>
+        <w:rPr>
+          <w:b w:val="0"/>
+          <w:i w:val="0"/>
+          <w:color w:val="666666"/>
+          <w:sz w:val="19"/>
+        </w:rPr>
+        <w:t>03:57</w:t>
+        <w:tab/>
+      </w:r>
+      <w:r>
+        <w:rPr>
+          <w:b w:val="0"/>
+          <w:i w:val="0"/>
+          <w:color w:val="222222"/>
+          <w:sz w:val="19"/>
+        </w:rPr>
+        <w:t>Listo. ¿Y la otra está acá nomás? Sí.</w:t>
+      </w:r>
+    </w:p>
+    <w:p>
+      <w:pPr>
+        <w:tabs>
+          <w:tab w:pos="850" w:val="left"/>
+        </w:tabs>
+        <w:spacing w:before="0" w:after="60" w:line="228" w:lineRule="exact"/>
+        <w:ind w:left="850" w:hanging="850"/>
+      </w:pPr>
+      <w:r>
+        <w:rPr>
+          <w:b w:val="0"/>
+          <w:i w:val="0"/>
+          <w:color w:val="666666"/>
+          <w:sz w:val="19"/>
+        </w:rPr>
+        <w:t>04:02</w:t>
+        <w:tab/>
+      </w:r>
+      <w:r>
+        <w:rPr>
+          <w:b w:val="0"/>
+          <w:i w:val="0"/>
+          <w:color w:val="222222"/>
+          <w:sz w:val="19"/>
+        </w:rPr>
+        <w:t>¿La de abajo está aquí? Sí, la desconecto.</w:t>
+      </w:r>
+    </w:p>
     <w:p>
       <w:pPr>
         <w:spacing w:before="0" w:after="0" w:line="20" w:lineRule="exact"/>

</xml_diff>